<commit_message>
updated docs to remove insider trading metrics
</commit_message>
<xml_diff>
--- a/StockAI_BRD.docx
+++ b/StockAI_BRD.docx
@@ -53,25 +53,7 @@
           <w:sz w:val="24"/>
           <w:szCs w:val="24"/>
         </w:rPr>
-        <w:t xml:space="preserve">Version </w:t>
-      </w:r>
-      <w:proofErr w:type="gramStart"/>
-      <w:r>
-        <w:rPr>
-          <w:color w:val="888888"/>
-          <w:sz w:val="24"/>
-          <w:szCs w:val="24"/>
-        </w:rPr>
-        <w:t>1.0  |</w:t>
-      </w:r>
-      <w:proofErr w:type="gramEnd"/>
-      <w:r>
-        <w:rPr>
-          <w:color w:val="888888"/>
-          <w:sz w:val="24"/>
-          <w:szCs w:val="24"/>
-        </w:rPr>
-        <w:t xml:space="preserve">  Personal Project</w:t>
+        <w:t>Version 1.0  |  Personal Project</w:t>
       </w:r>
     </w:p>
     <w:p>
@@ -264,23 +246,13 @@
             </w:tcMar>
           </w:tcPr>
           <w:p>
-            <w:proofErr w:type="spellStart"/>
             <w:r>
               <w:rPr>
                 <w:color w:val="000000"/>
                 <w:sz w:val="20"/>
                 <w:szCs w:val="20"/>
               </w:rPr>
-              <w:t>StockAI</w:t>
-            </w:r>
-            <w:proofErr w:type="spellEnd"/>
-            <w:r>
-              <w:rPr>
-                <w:color w:val="000000"/>
-                <w:sz w:val="20"/>
-                <w:szCs w:val="20"/>
-              </w:rPr>
-              <w:t xml:space="preserve"> — Multi-Agent Sentiment Platform</w:t>
+              <w:t>StockAI — Multi-Agent Sentiment Platform</w:t>
             </w:r>
           </w:p>
         </w:tc>
@@ -1338,7 +1310,6 @@
             </w:tcMar>
           </w:tcPr>
           <w:p>
-            <w:proofErr w:type="gramStart"/>
             <w:r>
               <w:rPr>
                 <w:b/>
@@ -1350,7 +1321,6 @@
               <w:lastRenderedPageBreak/>
               <w:t>Social Media Agent</w:t>
             </w:r>
-            <w:proofErr w:type="gramEnd"/>
           </w:p>
         </w:tc>
         <w:tc>
@@ -1617,36 +1587,20 @@
         <w:spacing w:before="40" w:after="40"/>
       </w:pPr>
       <w:r>
-        <w:t xml:space="preserve">Backend: Python with </w:t>
-      </w:r>
-      <w:proofErr w:type="spellStart"/>
-      <w:r>
-        <w:t>FastAPI</w:t>
-      </w:r>
-      <w:proofErr w:type="spellEnd"/>
-      <w:r>
-        <w:t xml:space="preserve"> for the REST API layer</w:t>
-      </w:r>
-    </w:p>
-    <w:p>
-      <w:pPr>
-        <w:pStyle w:val="ListParagraph"/>
-        <w:numPr>
-          <w:ilvl w:val="0"/>
-          <w:numId w:val="2"/>
-        </w:numPr>
-        <w:spacing w:before="40" w:after="40"/>
-      </w:pPr>
-      <w:r>
-        <w:t xml:space="preserve">Agent Framework: </w:t>
-      </w:r>
-      <w:proofErr w:type="spellStart"/>
-      <w:r>
-        <w:t>LangGraph</w:t>
-      </w:r>
-      <w:proofErr w:type="spellEnd"/>
-      <w:r>
-        <w:t xml:space="preserve"> for multi-agent orchestration and state management</w:t>
+        <w:t>Backend: Python with FastAPI for the REST API layer</w:t>
+      </w:r>
+    </w:p>
+    <w:p>
+      <w:pPr>
+        <w:pStyle w:val="ListParagraph"/>
+        <w:numPr>
+          <w:ilvl w:val="0"/>
+          <w:numId w:val="2"/>
+        </w:numPr>
+        <w:spacing w:before="40" w:after="40"/>
+      </w:pPr>
+      <w:r>
+        <w:t>Agent Framework: LangGraph for multi-agent orchestration and state management</w:t>
       </w:r>
     </w:p>
     <w:p>
@@ -1743,7 +1697,7 @@
         <w:spacing w:before="40" w:after="40"/>
       </w:pPr>
       <w:r>
-        <w:t>Covers income statements, balance sheets, cash flow statements, key ratios, EPS vs. analyst estimates, and insider transactions</w:t>
+        <w:t>Covers income statements, balance sheets, cash flow statements, key ratios, EPS vs. analyst estimates</w:t>
       </w:r>
     </w:p>
     <w:p>
@@ -1808,13 +1762,7 @@
         <w:spacing w:before="40" w:after="40"/>
       </w:pPr>
       <w:r>
-        <w:t>Price-to-Earnings Ratio (P/E) —</w:t>
-      </w:r>
-      <w:r>
-        <w:t xml:space="preserve"> </w:t>
-      </w:r>
-      <w:r>
-        <w:t>forward</w:t>
+        <w:t>Price-to-Earnings Ratio (P/E) — forward</w:t>
       </w:r>
     </w:p>
     <w:p>
@@ -1845,19 +1793,6 @@
     </w:p>
     <w:p>
       <w:pPr>
-        <w:pStyle w:val="ListParagraph"/>
-        <w:numPr>
-          <w:ilvl w:val="0"/>
-          <w:numId w:val="2"/>
-        </w:numPr>
-        <w:spacing w:before="40" w:after="40"/>
-      </w:pPr>
-      <w:r>
-        <w:t>Insider trading activity (executive buys/sells)</w:t>
-      </w:r>
-    </w:p>
-    <w:p>
-      <w:pPr>
         <w:spacing w:before="80" w:after="80"/>
       </w:pPr>
     </w:p>
@@ -1879,29 +1814,8 @@
         <w:spacing w:before="40" w:after="40"/>
       </w:pPr>
       <w:r>
-        <w:t xml:space="preserve">Structured JSON payload: </w:t>
-      </w:r>
-      <w:proofErr w:type="gramStart"/>
-      <w:r>
-        <w:t>{ ticker</w:t>
-      </w:r>
-      <w:proofErr w:type="gramEnd"/>
-      <w:r>
-        <w:t xml:space="preserve">, metrics, signal: </w:t>
-      </w:r>
-      <w:proofErr w:type="spellStart"/>
-      <w:r>
-        <w:t>bullish|bearish|neutral</w:t>
-      </w:r>
-      <w:proofErr w:type="spellEnd"/>
-      <w:r>
-        <w:t xml:space="preserve">, </w:t>
-      </w:r>
-      <w:proofErr w:type="gramStart"/>
-      <w:r>
-        <w:t>summary }</w:t>
-      </w:r>
-      <w:proofErr w:type="gramEnd"/>
+        <w:t>Structured JSON payload: { ticker, metrics, signal: bullish|bearish|neutral, summary }</w:t>
+      </w:r>
     </w:p>
     <w:p>
       <w:pPr>
@@ -1940,28 +1854,7 @@
         <w:spacing w:before="40" w:after="40"/>
       </w:pPr>
       <w:r>
-        <w:t xml:space="preserve">WHEN the Fundamentals Agent has collected data, THE SYSTEM SHALL generate a bullish, bearish, or neutral signal with a </w:t>
-      </w:r>
-      <w:proofErr w:type="gramStart"/>
-      <w:r>
-        <w:t>short written</w:t>
-      </w:r>
-      <w:proofErr w:type="gramEnd"/>
-      <w:r>
-        <w:t xml:space="preserve"> rationale.</w:t>
-      </w:r>
-    </w:p>
-    <w:p>
-      <w:pPr>
-        <w:pStyle w:val="ListParagraph"/>
-        <w:numPr>
-          <w:ilvl w:val="0"/>
-          <w:numId w:val="2"/>
-        </w:numPr>
-        <w:spacing w:before="40" w:after="40"/>
-      </w:pPr>
-      <w:r>
-        <w:t>WHEN insider trading data is available via FMP, THE SYSTEM SHALL include executive buy/sell activity as a factor in the signal.</w:t>
+        <w:t>WHEN the Fundamentals Agent has collected data, THE SYSTEM SHALL generate a bullish, bearish, or neutral signal with a short written rationale.</w:t>
       </w:r>
     </w:p>
     <w:p>
@@ -2008,21 +1901,8 @@
         <w:spacing w:before="40" w:after="40"/>
       </w:pPr>
       <w:r>
-        <w:t>Subreddits: r/</w:t>
-      </w:r>
-      <w:proofErr w:type="spellStart"/>
-      <w:r>
-        <w:t>wallstreetbets</w:t>
-      </w:r>
-      <w:proofErr w:type="spellEnd"/>
-      <w:r>
-        <w:t>, r/stocks, r/investing, r/</w:t>
-      </w:r>
-      <w:proofErr w:type="spellStart"/>
-      <w:r>
-        <w:t>StockMarket</w:t>
-      </w:r>
-      <w:proofErr w:type="spellEnd"/>
+        <w:t>Subreddits: r/wallstreetbets, r/stocks, r/investing, r/StockMarket</w:t>
+      </w:r>
     </w:p>
     <w:p>
       <w:pPr>
@@ -2125,37 +2005,8 @@
         <w:spacing w:before="40" w:after="40"/>
       </w:pPr>
       <w:r>
-        <w:t xml:space="preserve">Structured JSON payload: </w:t>
-      </w:r>
-      <w:proofErr w:type="gramStart"/>
-      <w:r>
-        <w:t>{ ticker</w:t>
-      </w:r>
-      <w:proofErr w:type="gramEnd"/>
-      <w:r>
-        <w:t xml:space="preserve">, </w:t>
-      </w:r>
-      <w:proofErr w:type="spellStart"/>
-      <w:r>
-        <w:t>sentiment_score</w:t>
-      </w:r>
-      <w:proofErr w:type="spellEnd"/>
-      <w:r>
-        <w:t xml:space="preserve">, </w:t>
-      </w:r>
-      <w:proofErr w:type="spellStart"/>
-      <w:r>
-        <w:t>top_posts</w:t>
-      </w:r>
-      <w:proofErr w:type="spellEnd"/>
-      <w:r>
-        <w:t xml:space="preserve">, signal, </w:t>
-      </w:r>
-      <w:proofErr w:type="gramStart"/>
-      <w:r>
-        <w:t>summary }</w:t>
-      </w:r>
-      <w:proofErr w:type="gramEnd"/>
+        <w:t>Structured JSON payload: { ticker, sentiment_score, top_posts, signal, summary }</w:t>
+      </w:r>
     </w:p>
     <w:p>
       <w:pPr>
@@ -2180,15 +2031,7 @@
         <w:spacing w:before="40" w:after="40"/>
       </w:pPr>
       <w:r>
-        <w:t xml:space="preserve">WHEN the </w:t>
-      </w:r>
-      <w:proofErr w:type="gramStart"/>
-      <w:r>
-        <w:t>Social Media Agent</w:t>
-      </w:r>
-      <w:proofErr w:type="gramEnd"/>
-      <w:r>
-        <w:t xml:space="preserve"> runs, THE SYSTEM SHALL query the top posts mentioning the tracked ticker across target subreddits within the past 24-48 hours.</w:t>
+        <w:t>WHEN the Social Media Agent runs, THE SYSTEM SHALL query the top posts mentioning the tracked ticker across target subreddits within the past 24-48 hours.</w:t>
       </w:r>
     </w:p>
     <w:p>
@@ -2235,15 +2078,7 @@
         <w:spacing w:before="60" w:after="60"/>
       </w:pPr>
       <w:r>
-        <w:t xml:space="preserve">Social media analysis is limited to Reddit only. Twitter/X is excluded from v1 due to prohibitive API costs. </w:t>
-      </w:r>
-      <w:proofErr w:type="spellStart"/>
-      <w:r>
-        <w:t>StockTwits</w:t>
-      </w:r>
-      <w:proofErr w:type="spellEnd"/>
-      <w:r>
-        <w:t xml:space="preserve"> may be evaluated for v2 as it also offers a free tier.</w:t>
+        <w:t>Social media analysis is limited to Reddit only. Twitter/X is excluded from v1 due to prohibitive API costs. StockTwits may be evaluated for v2 as it also offers a free tier.</w:t>
       </w:r>
     </w:p>
     <w:p>
@@ -2408,29 +2243,8 @@
         <w:spacing w:before="40" w:after="40"/>
       </w:pPr>
       <w:r>
-        <w:t xml:space="preserve">Structured JSON payload: </w:t>
-      </w:r>
-      <w:proofErr w:type="gramStart"/>
-      <w:r>
-        <w:t>{ ticker</w:t>
-      </w:r>
-      <w:proofErr w:type="gramEnd"/>
-      <w:r>
-        <w:t xml:space="preserve">, </w:t>
-      </w:r>
-      <w:proofErr w:type="spellStart"/>
-      <w:r>
-        <w:t>relevant_articles</w:t>
-      </w:r>
-      <w:proofErr w:type="spellEnd"/>
-      <w:r>
-        <w:t xml:space="preserve">, sentiment, signal, </w:t>
-      </w:r>
-      <w:proofErr w:type="gramStart"/>
-      <w:r>
-        <w:t>summary }</w:t>
-      </w:r>
-      <w:proofErr w:type="gramEnd"/>
+        <w:t>Structured JSON payload: { ticker, relevant_articles, sentiment, signal, summary }</w:t>
+      </w:r>
     </w:p>
     <w:p>
       <w:pPr>
@@ -3561,7 +3375,6 @@
             </w:tcMar>
           </w:tcPr>
           <w:p>
-            <w:proofErr w:type="gramStart"/>
             <w:r>
               <w:rPr>
                 <w:b/>
@@ -3572,7 +3385,6 @@
               </w:rPr>
               <w:t>Social Media Agent</w:t>
             </w:r>
-            <w:proofErr w:type="gramEnd"/>
           </w:p>
         </w:tc>
         <w:tc>
@@ -3833,27 +3645,6 @@
     </w:p>
     <w:p>
       <w:pPr>
-        <w:pStyle w:val="ListParagraph"/>
-        <w:numPr>
-          <w:ilvl w:val="0"/>
-          <w:numId w:val="2"/>
-        </w:numPr>
-        <w:spacing w:before="40" w:after="40"/>
-      </w:pPr>
-      <w:r>
-        <w:t>Politician/insider trading agent (</w:t>
-      </w:r>
-      <w:proofErr w:type="spellStart"/>
-      <w:r>
-        <w:t>InsiderInformationAgent</w:t>
-      </w:r>
-      <w:proofErr w:type="spellEnd"/>
-      <w:r>
-        <w:t>) — deferred to v2</w:t>
-      </w:r>
-    </w:p>
-    <w:p>
-      <w:pPr>
         <w:spacing w:before="80" w:after="80"/>
       </w:pPr>
     </w:p>
@@ -3878,23 +3669,7 @@
         <w:spacing w:before="40" w:after="40"/>
       </w:pPr>
       <w:r>
-        <w:t xml:space="preserve">Finalize tech stack: React, </w:t>
-      </w:r>
-      <w:proofErr w:type="spellStart"/>
-      <w:r>
-        <w:t>FastAPI</w:t>
-      </w:r>
-      <w:proofErr w:type="spellEnd"/>
-      <w:r>
-        <w:t xml:space="preserve">, </w:t>
-      </w:r>
-      <w:proofErr w:type="spellStart"/>
-      <w:r>
-        <w:t>LangGraph</w:t>
-      </w:r>
-      <w:proofErr w:type="spellEnd"/>
-      <w:r>
-        <w:t>, Anthropic Claude API, SQLite</w:t>
+        <w:t>Finalize tech stack: React, FastAPI, LangGraph, Anthropic Claude API, SQLite</w:t>
       </w:r>
     </w:p>
     <w:p>
@@ -3907,23 +3682,7 @@
         <w:spacing w:before="40" w:after="40"/>
       </w:pPr>
       <w:r>
-        <w:t xml:space="preserve">Set up project repo and folder structure (React frontend, </w:t>
-      </w:r>
-      <w:proofErr w:type="spellStart"/>
-      <w:r>
-        <w:t>FastAPI</w:t>
-      </w:r>
-      <w:proofErr w:type="spellEnd"/>
-      <w:r>
-        <w:t xml:space="preserve"> backend, </w:t>
-      </w:r>
-      <w:proofErr w:type="spellStart"/>
-      <w:r>
-        <w:t>LangGraph</w:t>
-      </w:r>
-      <w:proofErr w:type="spellEnd"/>
-      <w:r>
-        <w:t xml:space="preserve"> agents)</w:t>
+        <w:t>Set up project repo and folder structure (React frontend, FastAPI backend, LangGraph agents)</w:t>
       </w:r>
     </w:p>
     <w:p>
@@ -3949,13 +3708,8 @@
         <w:spacing w:before="40" w:after="40"/>
       </w:pPr>
       <w:r>
-        <w:t xml:space="preserve">Integrate Reddit API and build </w:t>
-      </w:r>
-      <w:proofErr w:type="gramStart"/>
-      <w:r>
-        <w:t>Social Media Agent</w:t>
-      </w:r>
-      <w:proofErr w:type="gramEnd"/>
+        <w:t>Integrate Reddit API and build Social Media Agent</w:t>
+      </w:r>
     </w:p>
     <w:p>
       <w:pPr>

</xml_diff>